<commit_message>
Tidy detailed spec after verification: wording and ID ordering
Post-verification cleanups, none affecting requirements:
- Test-matrix preamble no longer describes the negatives in pre-revision
  microphone terms, and now names the NFC-off case.
- Privacy requirement covers permission and NFC state rather than only
  microphone permission.
- FR/AC/UAT entries reordered so they read in numeric order (the newly added
  FR-22, AC-17 and UAT-23/24 had been appended after their neighbours).

Verified: all IDs complete (FR-01..22, AC-01..17, UAT-01..24), structural
audit passes, no stale wording remains.

Co-Authored-By: Claude Opus 4.8 <noreply@anthropic.com>
Claude-Session: https://claude.ai/code/session_018gbuxK96fv3iC6hdg5uCm7
</commit_message>
<xml_diff>
--- a/deliverables/US1117/SAM_OnSite_Guard_Onboarding_Detailed_Spec.docx
+++ b/deliverables/US1117/SAM_OnSite_Guard_Onboarding_Detailed_Spec.docx
@@ -5918,7 +5918,7 @@
                 <w:sz w:val="18"/>
                 <w:szCs w:val="18"/>
               </w:rPr>
-              <w:t xml:space="preserve">  Telemetry records only stage and error codes and completion metrics. It does not keep microphone-permission state beyond need, does not log raw voice/transcript content beyond existing policy, and never routes fictional incident content into operational analytics.</w:t>
+              <w:t xml:space="preserve">  Telemetry records only stage and error codes and completion metrics. It does not keep permission or NFC state beyond need, does not log raw voice/transcript content beyond existing policy, and never routes fictional incident content into operational analytics.</w:t>
             </w:r>
           </w:p>
         </w:tc>
@@ -6084,7 +6084,7 @@
                 <w:sz w:val="18"/>
                 <w:szCs w:val="18"/>
               </w:rPr>
-              <w:t xml:space="preserve">FR-22</w:t>
+              <w:t xml:space="preserve">FR-21</w:t>
             </w:r>
           </w:p>
         </w:tc>
@@ -6120,7 +6120,7 @@
                 <w:sz w:val="18"/>
                 <w:szCs w:val="18"/>
               </w:rPr>
-              <w:t xml:space="preserve">NFC gate</w:t>
+              <w:t xml:space="preserve">Tone and engagement</w:t>
             </w:r>
           </w:p>
         </w:tc>
@@ -6168,7 +6168,7 @@
                 <w:sz w:val="18"/>
                 <w:szCs w:val="18"/>
               </w:rPr>
-              <w:t xml:space="preserve">  After permissions, SAM links the guard to the NFC setting — NFC is what reads the checkpoint tags. The guard switches it on, returns, and says or types “done”. SAM confirms NFC is actually on before continuing, and names it if it is not. Same rule as permissions: the guard’s confirmation is a prompt to check, not proof.</w:t>
+              <w:t xml:space="preserve">  The experience must feel like receiving a useful new tool, not sitting a test. SAM opens with a warm, personal greeting that names what it does for the guard and why that helps them, frames each step as a benefit, encourages briefly after each success, uses short everyday language, and closes warmly. A dry “do this, then that” sequence does not meet this requirement. See Tone and script for the principles and reference copy.</w:t>
             </w:r>
           </w:p>
         </w:tc>
@@ -6209,7 +6209,7 @@
                 <w:sz w:val="18"/>
                 <w:szCs w:val="18"/>
               </w:rPr>
-              <w:t xml:space="preserve">FR-21</w:t>
+              <w:t xml:space="preserve">FR-22</w:t>
             </w:r>
           </w:p>
         </w:tc>
@@ -6245,7 +6245,7 @@
                 <w:sz w:val="18"/>
                 <w:szCs w:val="18"/>
               </w:rPr>
-              <w:t xml:space="preserve">Tone and engagement</w:t>
+              <w:t xml:space="preserve">NFC gate</w:t>
             </w:r>
           </w:p>
         </w:tc>
@@ -6293,7 +6293,7 @@
                 <w:sz w:val="18"/>
                 <w:szCs w:val="18"/>
               </w:rPr>
-              <w:t xml:space="preserve">  The experience must feel like receiving a useful new tool, not sitting a test. SAM opens with a warm, personal greeting that names what it does for the guard and why that helps them, frames each step as a benefit, encourages briefly after each success, uses short everyday language, and closes warmly. A dry “do this, then that” sequence does not meet this requirement. See Tone and script for the principles and reference copy.</w:t>
+              <w:t xml:space="preserve">  After permissions, SAM links the guard to the NFC setting — NFC is what reads the checkpoint tags. The guard switches it on, returns, and says or types “done”. SAM confirms NFC is actually on before continuing, and names it if it is not. Same rule as permissions: the guard’s confirmation is a prompt to check, not proof.</w:t>
             </w:r>
           </w:p>
         </w:tc>
@@ -9841,7 +9841,7 @@
                 <w:sz w:val="18"/>
                 <w:szCs w:val="18"/>
               </w:rPr>
-              <w:t xml:space="preserve">AC-17</w:t>
+              <w:t xml:space="preserve">AC-16</w:t>
             </w:r>
           </w:p>
         </w:tc>
@@ -9877,7 +9877,7 @@
                 <w:sz w:val="18"/>
                 <w:szCs w:val="18"/>
               </w:rPr>
-              <w:t xml:space="preserve">FR-22</w:t>
+              <w:t xml:space="preserve">FR-21</w:t>
             </w:r>
           </w:p>
         </w:tc>
@@ -9913,7 +9913,7 @@
                 <w:sz w:val="18"/>
                 <w:szCs w:val="18"/>
               </w:rPr>
-              <w:t xml:space="preserve">Given the NFC step, when the guard enables NFC and says or types “done”, then SAM confirms NFC is on before continuing; if NFC is off, SAM says so and links the guard back rather than advancing.</w:t>
+              <w:t xml:space="preserve">Given the full run-through, then it opens with a warm personal greeting, each step is framed as a benefit with a brief encouragement after it, and the close is warm — signed off by product on a read-through, and at least four of five test guards describing it as welcoming rather than test-like. If fewer do, the copy is revised and re-run.</w:t>
             </w:r>
           </w:p>
         </w:tc>
@@ -9954,7 +9954,7 @@
                 <w:sz w:val="18"/>
                 <w:szCs w:val="18"/>
               </w:rPr>
-              <w:t xml:space="preserve">AC-16</w:t>
+              <w:t xml:space="preserve">AC-17</w:t>
             </w:r>
           </w:p>
         </w:tc>
@@ -9990,7 +9990,7 @@
                 <w:sz w:val="18"/>
                 <w:szCs w:val="18"/>
               </w:rPr>
-              <w:t xml:space="preserve">FR-21</w:t>
+              <w:t xml:space="preserve">FR-22</w:t>
             </w:r>
           </w:p>
         </w:tc>
@@ -10026,7 +10026,7 @@
                 <w:sz w:val="18"/>
                 <w:szCs w:val="18"/>
               </w:rPr>
-              <w:t xml:space="preserve">Given the full run-through, then it opens with a warm personal greeting, each step is framed as a benefit with a brief encouragement after it, and the close is warm — signed off by product on a read-through, and at least four of five test guards describing it as welcoming rather than test-like. If fewer do, the copy is revised and re-run.</w:t>
+              <w:t xml:space="preserve">Given the NFC step, when the guard enables NFC and says or types “done”, then SAM confirms NFC is on before continuing; if NFC is off, SAM says so and links the guard back rather than advancing.</w:t>
             </w:r>
           </w:p>
         </w:tc>
@@ -10078,7 +10078,7 @@
           <w:sz w:val="19"/>
           <w:szCs w:val="19"/>
         </w:rPr>
-        <w:t xml:space="preserve">Positive and negative tests. Negatives cover skip, mic denial, mic unavailable, transcription failure, voice-correction failure, manual-save failure, isolation failure, concurrency, and network/device resume.</w:t>
+        <w:t xml:space="preserve">Positive and negative tests. Negatives cover skip, a permission left off, a permission that cannot be granted, NFC off, transcription failure, voice-correction failure, manual-save failure, isolation failure, concurrency, and network/device resume.</w:t>
       </w:r>
     </w:p>
     <w:tbl>
@@ -13410,7 +13410,7 @@
                 <w:sz w:val="18"/>
                 <w:szCs w:val="18"/>
               </w:rPr>
-              <w:t xml:space="preserve">UAT-23</w:t>
+              <w:t xml:space="preserve">UAT-22</w:t>
             </w:r>
           </w:p>
         </w:tc>
@@ -13446,7 +13446,7 @@
                 <w:sz w:val="18"/>
                 <w:szCs w:val="18"/>
               </w:rPr>
-              <w:t xml:space="preserve">AC-04</w:t>
+              <w:t xml:space="preserve">AC-16</w:t>
             </w:r>
           </w:p>
         </w:tc>
@@ -13482,7 +13482,7 @@
                 <w:sz w:val="18"/>
                 <w:szCs w:val="18"/>
               </w:rPr>
-              <w:t xml:space="preserve">Confirm the permissions step by typing or tapping, before microphone permission is granted.</w:t>
+              <w:t xml:space="preserve">Full run-through with at least five test guards, reviewing tone.</w:t>
             </w:r>
           </w:p>
         </w:tc>
@@ -13518,7 +13518,7 @@
                 <w:sz w:val="18"/>
                 <w:szCs w:val="18"/>
               </w:rPr>
-              <w:t xml:space="preserve">Typed/tapped “done” is accepted; no voice needed at this point.</w:t>
+              <w:t xml:space="preserve">Warm personal opening; each step framed as a benefit with brief encouragement; warm close. At least four of five describe it as welcoming, not a test; product signs off the copy.</w:t>
             </w:r>
           </w:p>
         </w:tc>
@@ -13559,7 +13559,7 @@
                 <w:sz w:val="18"/>
                 <w:szCs w:val="18"/>
               </w:rPr>
-              <w:t xml:space="preserve">UAT-24</w:t>
+              <w:t xml:space="preserve">UAT-23</w:t>
             </w:r>
           </w:p>
         </w:tc>
@@ -13595,7 +13595,7 @@
                 <w:sz w:val="18"/>
                 <w:szCs w:val="18"/>
               </w:rPr>
-              <w:t xml:space="preserve">AC-17</w:t>
+              <w:t xml:space="preserve">AC-04</w:t>
             </w:r>
           </w:p>
         </w:tc>
@@ -13631,7 +13631,7 @@
                 <w:sz w:val="18"/>
                 <w:szCs w:val="18"/>
               </w:rPr>
-              <w:t xml:space="preserve">NFC step with NFC on, then repeated with NFC off. (negative)</w:t>
+              <w:t xml:space="preserve">Confirm the permissions step by typing or tapping, before microphone permission is granted.</w:t>
             </w:r>
           </w:p>
         </w:tc>
@@ -13667,7 +13667,7 @@
                 <w:sz w:val="18"/>
                 <w:szCs w:val="18"/>
               </w:rPr>
-              <w:t xml:space="preserve">Advances only when NFC is on; when off SAM names it and links back.</w:t>
+              <w:t xml:space="preserve">Typed/tapped “done” is accepted; no voice needed at this point.</w:t>
             </w:r>
           </w:p>
         </w:tc>
@@ -13708,7 +13708,7 @@
                 <w:sz w:val="18"/>
                 <w:szCs w:val="18"/>
               </w:rPr>
-              <w:t xml:space="preserve">UAT-22</w:t>
+              <w:t xml:space="preserve">UAT-24</w:t>
             </w:r>
           </w:p>
         </w:tc>
@@ -13744,7 +13744,7 @@
                 <w:sz w:val="18"/>
                 <w:szCs w:val="18"/>
               </w:rPr>
-              <w:t xml:space="preserve">AC-16</w:t>
+              <w:t xml:space="preserve">AC-17</w:t>
             </w:r>
           </w:p>
         </w:tc>
@@ -13780,7 +13780,7 @@
                 <w:sz w:val="18"/>
                 <w:szCs w:val="18"/>
               </w:rPr>
-              <w:t xml:space="preserve">Full run-through with at least five test guards, reviewing tone.</w:t>
+              <w:t xml:space="preserve">NFC step with NFC on, then repeated with NFC off. (negative)</w:t>
             </w:r>
           </w:p>
         </w:tc>
@@ -13816,7 +13816,7 @@
                 <w:sz w:val="18"/>
                 <w:szCs w:val="18"/>
               </w:rPr>
-              <w:t xml:space="preserve">Warm personal opening; each step framed as a benefit with brief encouragement; warm close. At least four of five describe it as welcoming, not a test; product signs off the copy.</w:t>
+              <w:t xml:space="preserve">Advances only when NFC is on; when off SAM names it and links back.</w:t>
             </w:r>
           </w:p>
         </w:tc>

</xml_diff>

<commit_message>
Fix residual ask-step absolutes; verifier PASS on all gates
The independent verifier caught two leftover 'no report is created' claims in
the detailed document (flow step 5 and the FR-08 traceability row) that
contradicted the corrected FR-08 - real screenshots show even questions are
logged as activities today. Both now use the honest formulation: nothing live
results; any record the platform logs carries the training flag. Also aligned
the brief's settings-link wording with the real two-step (App-info page, then
tap Permissions) and refreshed the README. Re-verification passed all gates;
brief remains exactly 4 pages.

Co-Authored-By: Claude Fable 5 <noreply@anthropic.com>
Claude-Session: https://claude.ai/code/session_018gbuxK96fv3iC6hdg5uCm7
</commit_message>
<xml_diff>
--- a/deliverables/US1117/SAM_OnSite_Guard_Onboarding_Detailed_Spec.docx
+++ b/deliverables/US1117/SAM_OnSite_Guard_Onboarding_Detailed_Spec.docx
@@ -1892,7 +1892,7 @@
           <w:sz w:val="19"/>
           <w:szCs w:val="19"/>
         </w:rPr>
-        <w:t xml:space="preserve">The guard presses Talk and asks SAM a practice question; the first successful transcription doubles as the microphone check. SAM answers, then reassures them they can ask anything — no report is created.</w:t>
+        <w:t xml:space="preserve">The guard presses Talk and asks SAM a practice question; the first successful transcription doubles as the microphone check. SAM answers, then reassures them they can ask anything — nothing live results; any record the platform logs carries the training flag.</w:t>
       </w:r>
     </w:p>
     <w:p>
@@ -15587,7 +15587,7 @@
                 <w:sz w:val="18"/>
                 <w:szCs w:val="18"/>
               </w:rPr>
-              <w:t xml:space="preserve">Ask a question (SAM answers, no report)</w:t>
+              <w:t xml:space="preserve">Ask a question (nothing live)</w:t>
             </w:r>
           </w:p>
         </w:tc>
@@ -15731,7 +15731,7 @@
                 <w:sz w:val="18"/>
                 <w:szCs w:val="18"/>
               </w:rPr>
-              <w:t xml:space="preserve">Answer given; no report</w:t>
+              <w:t xml:space="preserve">Answer given; nothing live — any record training-flagged</w:t>
             </w:r>
           </w:p>
         </w:tc>

</xml_diff>

<commit_message>
Fix stale auto-verify claim in brief error table; reorder FR-25
The independent verifier found one blocking defect: the brief's error table
still said SAM 'names exactly what is missing' and 'never advances on the
guard's word alone' — the auto-verify claim corrected everywhere else, which
also contradicted the detailed document's MVP framing. The row now states the
MVP behaviour honestly (SAM takes the confirmation and moves on, so a missed
setting surfaces later — the argument for reading settings back) and covers
all three gates rather than only permissions and NFC.

Also moved FR-25 after FR-24 so the requirements table reads in numeric order.

Re-checked: stale phrasing absent from both documents, MVP framing present in
both, structural audits pass.

Co-Authored-By: Claude Opus 5 <noreply@anthropic.com>
Claude-Session: https://claude.ai/code/session_018gbuxK96fv3iC6hdg5uCm7
</commit_message>
<xml_diff>
--- a/deliverables/US1117/SAM_OnSite_Guard_Onboarding_Detailed_Spec.docx
+++ b/deliverables/US1117/SAM_OnSite_Guard_Onboarding_Detailed_Spec.docx
@@ -6243,6 +6243,506 @@
                 <w:sz w:val="18"/>
                 <w:szCs w:val="18"/>
               </w:rPr>
+              <w:t xml:space="preserve">FR-21</w:t>
+            </w:r>
+          </w:p>
+        </w:tc>
+        <w:tc>
+          <w:tcPr>
+            <w:tcW w:type="dxa" w:w="2100"/>
+            <w:tcBorders>
+              <w:top w:val="none"/>
+              <w:left w:val="none"/>
+              <w:bottom w:val="none"/>
+              <w:right w:val="none"/>
+            </w:tcBorders>
+            <w:tcMar>
+              <w:top w:type="dxa" w:w="56"/>
+              <w:left w:type="dxa" w:w="40"/>
+              <w:bottom w:type="dxa" w:w="56"/>
+              <w:right w:type="dxa" w:w="150"/>
+            </w:tcMar>
+            <w:vAlign w:val="top"/>
+          </w:tcPr>
+          <w:p>
+            <w:pPr>
+              <w:spacing w:after="0" w:line="248" w:lineRule="auto"/>
+            </w:pPr>
+            <w:r>
+              <w:rPr>
+                <w:rFonts w:ascii="Calibri" w:cs="Calibri" w:eastAsia="Calibri" w:hAnsi="Calibri"/>
+                <w:b/>
+                <w:bCs/>
+                <w:i w:val="false"/>
+                <w:iCs w:val="false"/>
+                <w:color w:val="3A3A38"/>
+                <w:sz w:val="18"/>
+                <w:szCs w:val="18"/>
+              </w:rPr>
+              <w:t xml:space="preserve">Tone and engagement</w:t>
+            </w:r>
+          </w:p>
+        </w:tc>
+        <w:tc>
+          <w:tcPr>
+            <w:tcW w:type="dxa" w:w="6698"/>
+            <w:tcBorders>
+              <w:top w:val="none"/>
+              <w:left w:val="none"/>
+              <w:bottom w:val="none"/>
+              <w:right w:val="none"/>
+            </w:tcBorders>
+            <w:tcMar>
+              <w:top w:type="dxa" w:w="56"/>
+              <w:left w:type="dxa" w:w="40"/>
+              <w:bottom w:type="dxa" w:w="56"/>
+              <w:right w:type="dxa" w:w="150"/>
+            </w:tcMar>
+            <w:vAlign w:val="top"/>
+          </w:tcPr>
+          <w:p>
+            <w:pPr>
+              <w:spacing w:after="0" w:line="248" w:lineRule="auto"/>
+            </w:pPr>
+            <w:r>
+              <w:rPr>
+                <w:rFonts w:ascii="Calibri" w:cs="Calibri" w:eastAsia="Calibri" w:hAnsi="Calibri"/>
+                <w:b/>
+                <w:bCs/>
+                <w:color w:val="43724E"/>
+                <w:spacing w:val="6"/>
+                <w:sz w:val="14"/>
+                <w:szCs w:val="14"/>
+              </w:rPr>
+              <w:t xml:space="preserve">CONFIRMED</w:t>
+            </w:r>
+            <w:r>
+              <w:rPr>
+                <w:rFonts w:ascii="Calibri" w:cs="Calibri" w:eastAsia="Calibri" w:hAnsi="Calibri"/>
+                <w:b w:val="false"/>
+                <w:bCs w:val="false"/>
+                <w:i w:val="false"/>
+                <w:iCs w:val="false"/>
+                <w:color w:val="3A3A38"/>
+                <w:sz w:val="18"/>
+                <w:szCs w:val="18"/>
+              </w:rPr>
+              <w:t xml:space="preserve">  The experience must feel like receiving a useful new tool, not sitting a test. SAM opens with a warm, personal greeting that names what it does for the guard and why that helps them, frames each step as a benefit, encourages briefly after each success, uses short everyday language, and closes warmly. A dry “do this, then that” sequence does not meet this requirement. See Tone and script for the principles and reference copy.</w:t>
+            </w:r>
+          </w:p>
+        </w:tc>
+      </w:tr>
+      <w:tr>
+        <w:trPr>
+          <w:cantSplit/>
+        </w:trPr>
+        <w:tc>
+          <w:tcPr>
+            <w:tcW w:type="dxa" w:w="850"/>
+            <w:tcBorders>
+              <w:top w:val="none"/>
+              <w:left w:val="none"/>
+              <w:bottom w:val="none"/>
+              <w:right w:val="none"/>
+            </w:tcBorders>
+            <w:tcMar>
+              <w:top w:type="dxa" w:w="56"/>
+              <w:left w:type="dxa" w:w="40"/>
+              <w:bottom w:type="dxa" w:w="56"/>
+              <w:right w:type="dxa" w:w="150"/>
+            </w:tcMar>
+            <w:vAlign w:val="top"/>
+          </w:tcPr>
+          <w:p>
+            <w:pPr>
+              <w:spacing w:after="0" w:line="248" w:lineRule="auto"/>
+            </w:pPr>
+            <w:r>
+              <w:rPr>
+                <w:rFonts w:ascii="Calibri" w:cs="Calibri" w:eastAsia="Calibri" w:hAnsi="Calibri"/>
+                <w:b w:val="false"/>
+                <w:bCs w:val="false"/>
+                <w:i w:val="false"/>
+                <w:iCs w:val="false"/>
+                <w:color w:val="3A3A38"/>
+                <w:sz w:val="18"/>
+                <w:szCs w:val="18"/>
+              </w:rPr>
+              <w:t xml:space="preserve">FR-22</w:t>
+            </w:r>
+          </w:p>
+        </w:tc>
+        <w:tc>
+          <w:tcPr>
+            <w:tcW w:type="dxa" w:w="2100"/>
+            <w:tcBorders>
+              <w:top w:val="none"/>
+              <w:left w:val="none"/>
+              <w:bottom w:val="none"/>
+              <w:right w:val="none"/>
+            </w:tcBorders>
+            <w:tcMar>
+              <w:top w:type="dxa" w:w="56"/>
+              <w:left w:type="dxa" w:w="40"/>
+              <w:bottom w:type="dxa" w:w="56"/>
+              <w:right w:type="dxa" w:w="150"/>
+            </w:tcMar>
+            <w:vAlign w:val="top"/>
+          </w:tcPr>
+          <w:p>
+            <w:pPr>
+              <w:spacing w:after="0" w:line="248" w:lineRule="auto"/>
+            </w:pPr>
+            <w:r>
+              <w:rPr>
+                <w:rFonts w:ascii="Calibri" w:cs="Calibri" w:eastAsia="Calibri" w:hAnsi="Calibri"/>
+                <w:b/>
+                <w:bCs/>
+                <w:i w:val="false"/>
+                <w:iCs w:val="false"/>
+                <w:color w:val="3A3A38"/>
+                <w:sz w:val="18"/>
+                <w:szCs w:val="18"/>
+              </w:rPr>
+              <w:t xml:space="preserve">NFC gate</w:t>
+            </w:r>
+          </w:p>
+        </w:tc>
+        <w:tc>
+          <w:tcPr>
+            <w:tcW w:type="dxa" w:w="6698"/>
+            <w:tcBorders>
+              <w:top w:val="none"/>
+              <w:left w:val="none"/>
+              <w:bottom w:val="none"/>
+              <w:right w:val="none"/>
+            </w:tcBorders>
+            <w:tcMar>
+              <w:top w:type="dxa" w:w="56"/>
+              <w:left w:type="dxa" w:w="40"/>
+              <w:bottom w:type="dxa" w:w="56"/>
+              <w:right w:type="dxa" w:w="150"/>
+            </w:tcMar>
+            <w:vAlign w:val="top"/>
+          </w:tcPr>
+          <w:p>
+            <w:pPr>
+              <w:spacing w:after="0" w:line="248" w:lineRule="auto"/>
+            </w:pPr>
+            <w:r>
+              <w:rPr>
+                <w:rFonts w:ascii="Calibri" w:cs="Calibri" w:eastAsia="Calibri" w:hAnsi="Calibri"/>
+                <w:b/>
+                <w:bCs/>
+                <w:color w:val="43724E"/>
+                <w:spacing w:val="6"/>
+                <w:sz w:val="14"/>
+                <w:szCs w:val="14"/>
+              </w:rPr>
+              <w:t xml:space="preserve">CONFIRMED</w:t>
+            </w:r>
+            <w:r>
+              <w:rPr>
+                <w:rFonts w:ascii="Calibri" w:cs="Calibri" w:eastAsia="Calibri" w:hAnsi="Calibri"/>
+                <w:b w:val="false"/>
+                <w:bCs w:val="false"/>
+                <w:i w:val="false"/>
+                <w:iCs w:val="false"/>
+                <w:color w:val="3A3A38"/>
+                <w:sz w:val="18"/>
+                <w:szCs w:val="18"/>
+              </w:rPr>
+              <w:t xml:space="preserve">  After permissions, SAM links the guard to the NFC setting — NFC reads the checkpoint tags. The guard switches it on, returns, and confirms. Not every site uses NFC, but having it on costs nothing and avoids a failure later, so it is part of setup for everyone.</w:t>
+            </w:r>
+          </w:p>
+        </w:tc>
+      </w:tr>
+      <w:tr>
+        <w:trPr>
+          <w:cantSplit/>
+        </w:trPr>
+        <w:tc>
+          <w:tcPr>
+            <w:tcW w:type="dxa" w:w="850"/>
+            <w:tcBorders>
+              <w:top w:val="none"/>
+              <w:left w:val="none"/>
+              <w:bottom w:val="none"/>
+              <w:right w:val="none"/>
+            </w:tcBorders>
+            <w:tcMar>
+              <w:top w:type="dxa" w:w="56"/>
+              <w:left w:type="dxa" w:w="40"/>
+              <w:bottom w:type="dxa" w:w="56"/>
+              <w:right w:type="dxa" w:w="150"/>
+            </w:tcMar>
+            <w:vAlign w:val="top"/>
+          </w:tcPr>
+          <w:p>
+            <w:pPr>
+              <w:spacing w:after="0" w:line="248" w:lineRule="auto"/>
+            </w:pPr>
+            <w:r>
+              <w:rPr>
+                <w:rFonts w:ascii="Calibri" w:cs="Calibri" w:eastAsia="Calibri" w:hAnsi="Calibri"/>
+                <w:b w:val="false"/>
+                <w:bCs w:val="false"/>
+                <w:i w:val="false"/>
+                <w:iCs w:val="false"/>
+                <w:color w:val="3A3A38"/>
+                <w:sz w:val="18"/>
+                <w:szCs w:val="18"/>
+              </w:rPr>
+              <w:t xml:space="preserve">FR-23</w:t>
+            </w:r>
+          </w:p>
+        </w:tc>
+        <w:tc>
+          <w:tcPr>
+            <w:tcW w:type="dxa" w:w="2100"/>
+            <w:tcBorders>
+              <w:top w:val="none"/>
+              <w:left w:val="none"/>
+              <w:bottom w:val="none"/>
+              <w:right w:val="none"/>
+            </w:tcBorders>
+            <w:tcMar>
+              <w:top w:type="dxa" w:w="56"/>
+              <w:left w:type="dxa" w:w="40"/>
+              <w:bottom w:type="dxa" w:w="56"/>
+              <w:right w:type="dxa" w:w="150"/>
+            </w:tcMar>
+            <w:vAlign w:val="top"/>
+          </w:tcPr>
+          <w:p>
+            <w:pPr>
+              <w:spacing w:after="0" w:line="248" w:lineRule="auto"/>
+            </w:pPr>
+            <w:r>
+              <w:rPr>
+                <w:rFonts w:ascii="Calibri" w:cs="Calibri" w:eastAsia="Calibri" w:hAnsi="Calibri"/>
+                <w:b/>
+                <w:bCs/>
+                <w:i w:val="false"/>
+                <w:iCs w:val="false"/>
+                <w:color w:val="3A3A38"/>
+                <w:sz w:val="18"/>
+                <w:szCs w:val="18"/>
+              </w:rPr>
+              <w:t xml:space="preserve">Background tracking gate</w:t>
+            </w:r>
+          </w:p>
+        </w:tc>
+        <w:tc>
+          <w:tcPr>
+            <w:tcW w:type="dxa" w:w="6698"/>
+            <w:tcBorders>
+              <w:top w:val="none"/>
+              <w:left w:val="none"/>
+              <w:bottom w:val="none"/>
+              <w:right w:val="none"/>
+            </w:tcBorders>
+            <w:tcMar>
+              <w:top w:type="dxa" w:w="56"/>
+              <w:left w:type="dxa" w:w="40"/>
+              <w:bottom w:type="dxa" w:w="56"/>
+              <w:right w:type="dxa" w:w="150"/>
+            </w:tcMar>
+            <w:vAlign w:val="top"/>
+          </w:tcPr>
+          <w:p>
+            <w:pPr>
+              <w:spacing w:after="0" w:line="248" w:lineRule="auto"/>
+            </w:pPr>
+            <w:r>
+              <w:rPr>
+                <w:rFonts w:ascii="Calibri" w:cs="Calibri" w:eastAsia="Calibri" w:hAnsi="Calibri"/>
+                <w:b/>
+                <w:bCs/>
+                <w:color w:val="43724E"/>
+                <w:spacing w:val="6"/>
+                <w:sz w:val="14"/>
+                <w:szCs w:val="14"/>
+              </w:rPr>
+              <w:t xml:space="preserve">CONFIRMED</w:t>
+            </w:r>
+            <w:r>
+              <w:rPr>
+                <w:rFonts w:ascii="Calibri" w:cs="Calibri" w:eastAsia="Calibri" w:hAnsi="Calibri"/>
+                <w:b w:val="false"/>
+                <w:bCs w:val="false"/>
+                <w:i w:val="false"/>
+                <w:iCs w:val="false"/>
+                <w:color w:val="3A3A38"/>
+                <w:sz w:val="18"/>
+                <w:szCs w:val="18"/>
+              </w:rPr>
+              <w:t xml:space="preserve">  The third and last setup gate: background tracking, which lives in SAM OnSite’s own settings screen. Same shape as the other two — SAM explains why it is needed, links straight to the setting from inside onboarding, the guard switches it on and returns to confirm. After this gate every setting the app needs is active and the practice steps can begin.</w:t>
+            </w:r>
+          </w:p>
+        </w:tc>
+      </w:tr>
+      <w:tr>
+        <w:trPr>
+          <w:cantSplit/>
+        </w:trPr>
+        <w:tc>
+          <w:tcPr>
+            <w:tcW w:type="dxa" w:w="850"/>
+            <w:tcBorders>
+              <w:top w:val="none"/>
+              <w:left w:val="none"/>
+              <w:bottom w:val="none"/>
+              <w:right w:val="none"/>
+            </w:tcBorders>
+            <w:tcMar>
+              <w:top w:type="dxa" w:w="56"/>
+              <w:left w:type="dxa" w:w="40"/>
+              <w:bottom w:type="dxa" w:w="56"/>
+              <w:right w:type="dxa" w:w="150"/>
+            </w:tcMar>
+            <w:vAlign w:val="top"/>
+          </w:tcPr>
+          <w:p>
+            <w:pPr>
+              <w:spacing w:after="0" w:line="248" w:lineRule="auto"/>
+            </w:pPr>
+            <w:r>
+              <w:rPr>
+                <w:rFonts w:ascii="Calibri" w:cs="Calibri" w:eastAsia="Calibri" w:hAnsi="Calibri"/>
+                <w:b w:val="false"/>
+                <w:bCs w:val="false"/>
+                <w:i w:val="false"/>
+                <w:iCs w:val="false"/>
+                <w:color w:val="3A3A38"/>
+                <w:sz w:val="18"/>
+                <w:szCs w:val="18"/>
+              </w:rPr>
+              <w:t xml:space="preserve">FR-24</w:t>
+            </w:r>
+          </w:p>
+        </w:tc>
+        <w:tc>
+          <w:tcPr>
+            <w:tcW w:type="dxa" w:w="2100"/>
+            <w:tcBorders>
+              <w:top w:val="none"/>
+              <w:left w:val="none"/>
+              <w:bottom w:val="none"/>
+              <w:right w:val="none"/>
+            </w:tcBorders>
+            <w:tcMar>
+              <w:top w:type="dxa" w:w="56"/>
+              <w:left w:type="dxa" w:w="40"/>
+              <w:bottom w:type="dxa" w:w="56"/>
+              <w:right w:type="dxa" w:w="150"/>
+            </w:tcMar>
+            <w:vAlign w:val="top"/>
+          </w:tcPr>
+          <w:p>
+            <w:pPr>
+              <w:spacing w:after="0" w:line="248" w:lineRule="auto"/>
+            </w:pPr>
+            <w:r>
+              <w:rPr>
+                <w:rFonts w:ascii="Calibri" w:cs="Calibri" w:eastAsia="Calibri" w:hAnsi="Calibri"/>
+                <w:b/>
+                <w:bCs/>
+                <w:i w:val="false"/>
+                <w:iCs w:val="false"/>
+                <w:color w:val="3A3A38"/>
+                <w:sz w:val="18"/>
+                <w:szCs w:val="18"/>
+              </w:rPr>
+              <w:t xml:space="preserve">Check the settings rather than asking</w:t>
+            </w:r>
+          </w:p>
+        </w:tc>
+        <w:tc>
+          <w:tcPr>
+            <w:tcW w:type="dxa" w:w="6698"/>
+            <w:tcBorders>
+              <w:top w:val="none"/>
+              <w:left w:val="none"/>
+              <w:bottom w:val="none"/>
+              <w:right w:val="none"/>
+            </w:tcBorders>
+            <w:tcMar>
+              <w:top w:type="dxa" w:w="56"/>
+              <w:left w:type="dxa" w:w="40"/>
+              <w:bottom w:type="dxa" w:w="56"/>
+              <w:right w:type="dxa" w:w="150"/>
+            </w:tcMar>
+            <w:vAlign w:val="top"/>
+          </w:tcPr>
+          <w:p>
+            <w:pPr>
+              <w:spacing w:after="0" w:line="248" w:lineRule="auto"/>
+            </w:pPr>
+            <w:r>
+              <w:rPr>
+                <w:rFonts w:ascii="Calibri" w:cs="Calibri" w:eastAsia="Calibri" w:hAnsi="Calibri"/>
+                <w:b/>
+                <w:bCs/>
+                <w:color w:val="A05A38"/>
+                <w:spacing w:val="6"/>
+                <w:sz w:val="14"/>
+                <w:szCs w:val="14"/>
+              </w:rPr>
+              <w:t xml:space="preserve">CHECK W/ ENG.</w:t>
+            </w:r>
+            <w:r>
+              <w:rPr>
+                <w:rFonts w:ascii="Calibri" w:cs="Calibri" w:eastAsia="Calibri" w:hAnsi="Calibri"/>
+                <w:b w:val="false"/>
+                <w:bCs w:val="false"/>
+                <w:i w:val="false"/>
+                <w:iCs w:val="false"/>
+                <w:color w:val="3A3A38"/>
+                <w:sz w:val="18"/>
+                <w:szCs w:val="18"/>
+              </w:rPr>
+              <w:t xml:space="preserve">  For the MVP the guard confirms each gate themselves. Reading the settings back would be materially better: it removes a step where a guard can confirm without having done it, and converts a confusing failure mid-shift into a clear message during onboarding. The Location screen already surfaces a “Permissions needed” status, so this is at least partly achievable today; how far it extends to NFC and background tracking is for engineering to confirm. Treat as the target state, not MVP scope.</w:t>
+            </w:r>
+          </w:p>
+        </w:tc>
+      </w:tr>
+      <w:tr>
+        <w:trPr>
+          <w:cantSplit/>
+        </w:trPr>
+        <w:tc>
+          <w:tcPr>
+            <w:tcW w:type="dxa" w:w="850"/>
+            <w:tcBorders>
+              <w:top w:val="none"/>
+              <w:left w:val="none"/>
+              <w:bottom w:val="none"/>
+              <w:right w:val="none"/>
+            </w:tcBorders>
+            <w:tcMar>
+              <w:top w:type="dxa" w:w="56"/>
+              <w:left w:type="dxa" w:w="40"/>
+              <w:bottom w:type="dxa" w:w="56"/>
+              <w:right w:type="dxa" w:w="150"/>
+            </w:tcMar>
+            <w:vAlign w:val="top"/>
+          </w:tcPr>
+          <w:p>
+            <w:pPr>
+              <w:spacing w:after="0" w:line="248" w:lineRule="auto"/>
+            </w:pPr>
+            <w:r>
+              <w:rPr>
+                <w:rFonts w:ascii="Calibri" w:cs="Calibri" w:eastAsia="Calibri" w:hAnsi="Calibri"/>
+                <w:b w:val="false"/>
+                <w:bCs w:val="false"/>
+                <w:i w:val="false"/>
+                <w:iCs w:val="false"/>
+                <w:color w:val="3A3A38"/>
+                <w:sz w:val="18"/>
+                <w:szCs w:val="18"/>
+              </w:rPr>
               <w:t xml:space="preserve">FR-25</w:t>
             </w:r>
           </w:p>
@@ -6328,506 +6828,6 @@
                 <w:szCs w:val="18"/>
               </w:rPr>
               <w:t xml:space="preserve">  The practical tips from the train-the-trainer deck are taught inside the practice steps, at the moment each becomes useful — SAM offering one as a natural aside, or the guard meeting the situation the tip is about — rather than listed on a screen or read out in sequence. A slide of tips read aloud does not meet this requirement. Which tips, and where each best fits, to be agreed with product once the slide is shared.</w:t>
-            </w:r>
-          </w:p>
-        </w:tc>
-      </w:tr>
-      <w:tr>
-        <w:trPr>
-          <w:cantSplit/>
-        </w:trPr>
-        <w:tc>
-          <w:tcPr>
-            <w:tcW w:type="dxa" w:w="850"/>
-            <w:tcBorders>
-              <w:top w:val="none"/>
-              <w:left w:val="none"/>
-              <w:bottom w:val="none"/>
-              <w:right w:val="none"/>
-            </w:tcBorders>
-            <w:tcMar>
-              <w:top w:type="dxa" w:w="56"/>
-              <w:left w:type="dxa" w:w="40"/>
-              <w:bottom w:type="dxa" w:w="56"/>
-              <w:right w:type="dxa" w:w="150"/>
-            </w:tcMar>
-            <w:vAlign w:val="top"/>
-          </w:tcPr>
-          <w:p>
-            <w:pPr>
-              <w:spacing w:after="0" w:line="248" w:lineRule="auto"/>
-            </w:pPr>
-            <w:r>
-              <w:rPr>
-                <w:rFonts w:ascii="Calibri" w:cs="Calibri" w:eastAsia="Calibri" w:hAnsi="Calibri"/>
-                <w:b w:val="false"/>
-                <w:bCs w:val="false"/>
-                <w:i w:val="false"/>
-                <w:iCs w:val="false"/>
-                <w:color w:val="3A3A38"/>
-                <w:sz w:val="18"/>
-                <w:szCs w:val="18"/>
-              </w:rPr>
-              <w:t xml:space="preserve">FR-21</w:t>
-            </w:r>
-          </w:p>
-        </w:tc>
-        <w:tc>
-          <w:tcPr>
-            <w:tcW w:type="dxa" w:w="2100"/>
-            <w:tcBorders>
-              <w:top w:val="none"/>
-              <w:left w:val="none"/>
-              <w:bottom w:val="none"/>
-              <w:right w:val="none"/>
-            </w:tcBorders>
-            <w:tcMar>
-              <w:top w:type="dxa" w:w="56"/>
-              <w:left w:type="dxa" w:w="40"/>
-              <w:bottom w:type="dxa" w:w="56"/>
-              <w:right w:type="dxa" w:w="150"/>
-            </w:tcMar>
-            <w:vAlign w:val="top"/>
-          </w:tcPr>
-          <w:p>
-            <w:pPr>
-              <w:spacing w:after="0" w:line="248" w:lineRule="auto"/>
-            </w:pPr>
-            <w:r>
-              <w:rPr>
-                <w:rFonts w:ascii="Calibri" w:cs="Calibri" w:eastAsia="Calibri" w:hAnsi="Calibri"/>
-                <w:b/>
-                <w:bCs/>
-                <w:i w:val="false"/>
-                <w:iCs w:val="false"/>
-                <w:color w:val="3A3A38"/>
-                <w:sz w:val="18"/>
-                <w:szCs w:val="18"/>
-              </w:rPr>
-              <w:t xml:space="preserve">Tone and engagement</w:t>
-            </w:r>
-          </w:p>
-        </w:tc>
-        <w:tc>
-          <w:tcPr>
-            <w:tcW w:type="dxa" w:w="6698"/>
-            <w:tcBorders>
-              <w:top w:val="none"/>
-              <w:left w:val="none"/>
-              <w:bottom w:val="none"/>
-              <w:right w:val="none"/>
-            </w:tcBorders>
-            <w:tcMar>
-              <w:top w:type="dxa" w:w="56"/>
-              <w:left w:type="dxa" w:w="40"/>
-              <w:bottom w:type="dxa" w:w="56"/>
-              <w:right w:type="dxa" w:w="150"/>
-            </w:tcMar>
-            <w:vAlign w:val="top"/>
-          </w:tcPr>
-          <w:p>
-            <w:pPr>
-              <w:spacing w:after="0" w:line="248" w:lineRule="auto"/>
-            </w:pPr>
-            <w:r>
-              <w:rPr>
-                <w:rFonts w:ascii="Calibri" w:cs="Calibri" w:eastAsia="Calibri" w:hAnsi="Calibri"/>
-                <w:b/>
-                <w:bCs/>
-                <w:color w:val="43724E"/>
-                <w:spacing w:val="6"/>
-                <w:sz w:val="14"/>
-                <w:szCs w:val="14"/>
-              </w:rPr>
-              <w:t xml:space="preserve">CONFIRMED</w:t>
-            </w:r>
-            <w:r>
-              <w:rPr>
-                <w:rFonts w:ascii="Calibri" w:cs="Calibri" w:eastAsia="Calibri" w:hAnsi="Calibri"/>
-                <w:b w:val="false"/>
-                <w:bCs w:val="false"/>
-                <w:i w:val="false"/>
-                <w:iCs w:val="false"/>
-                <w:color w:val="3A3A38"/>
-                <w:sz w:val="18"/>
-                <w:szCs w:val="18"/>
-              </w:rPr>
-              <w:t xml:space="preserve">  The experience must feel like receiving a useful new tool, not sitting a test. SAM opens with a warm, personal greeting that names what it does for the guard and why that helps them, frames each step as a benefit, encourages briefly after each success, uses short everyday language, and closes warmly. A dry “do this, then that” sequence does not meet this requirement. See Tone and script for the principles and reference copy.</w:t>
-            </w:r>
-          </w:p>
-        </w:tc>
-      </w:tr>
-      <w:tr>
-        <w:trPr>
-          <w:cantSplit/>
-        </w:trPr>
-        <w:tc>
-          <w:tcPr>
-            <w:tcW w:type="dxa" w:w="850"/>
-            <w:tcBorders>
-              <w:top w:val="none"/>
-              <w:left w:val="none"/>
-              <w:bottom w:val="none"/>
-              <w:right w:val="none"/>
-            </w:tcBorders>
-            <w:tcMar>
-              <w:top w:type="dxa" w:w="56"/>
-              <w:left w:type="dxa" w:w="40"/>
-              <w:bottom w:type="dxa" w:w="56"/>
-              <w:right w:type="dxa" w:w="150"/>
-            </w:tcMar>
-            <w:vAlign w:val="top"/>
-          </w:tcPr>
-          <w:p>
-            <w:pPr>
-              <w:spacing w:after="0" w:line="248" w:lineRule="auto"/>
-            </w:pPr>
-            <w:r>
-              <w:rPr>
-                <w:rFonts w:ascii="Calibri" w:cs="Calibri" w:eastAsia="Calibri" w:hAnsi="Calibri"/>
-                <w:b w:val="false"/>
-                <w:bCs w:val="false"/>
-                <w:i w:val="false"/>
-                <w:iCs w:val="false"/>
-                <w:color w:val="3A3A38"/>
-                <w:sz w:val="18"/>
-                <w:szCs w:val="18"/>
-              </w:rPr>
-              <w:t xml:space="preserve">FR-22</w:t>
-            </w:r>
-          </w:p>
-        </w:tc>
-        <w:tc>
-          <w:tcPr>
-            <w:tcW w:type="dxa" w:w="2100"/>
-            <w:tcBorders>
-              <w:top w:val="none"/>
-              <w:left w:val="none"/>
-              <w:bottom w:val="none"/>
-              <w:right w:val="none"/>
-            </w:tcBorders>
-            <w:tcMar>
-              <w:top w:type="dxa" w:w="56"/>
-              <w:left w:type="dxa" w:w="40"/>
-              <w:bottom w:type="dxa" w:w="56"/>
-              <w:right w:type="dxa" w:w="150"/>
-            </w:tcMar>
-            <w:vAlign w:val="top"/>
-          </w:tcPr>
-          <w:p>
-            <w:pPr>
-              <w:spacing w:after="0" w:line="248" w:lineRule="auto"/>
-            </w:pPr>
-            <w:r>
-              <w:rPr>
-                <w:rFonts w:ascii="Calibri" w:cs="Calibri" w:eastAsia="Calibri" w:hAnsi="Calibri"/>
-                <w:b/>
-                <w:bCs/>
-                <w:i w:val="false"/>
-                <w:iCs w:val="false"/>
-                <w:color w:val="3A3A38"/>
-                <w:sz w:val="18"/>
-                <w:szCs w:val="18"/>
-              </w:rPr>
-              <w:t xml:space="preserve">NFC gate</w:t>
-            </w:r>
-          </w:p>
-        </w:tc>
-        <w:tc>
-          <w:tcPr>
-            <w:tcW w:type="dxa" w:w="6698"/>
-            <w:tcBorders>
-              <w:top w:val="none"/>
-              <w:left w:val="none"/>
-              <w:bottom w:val="none"/>
-              <w:right w:val="none"/>
-            </w:tcBorders>
-            <w:tcMar>
-              <w:top w:type="dxa" w:w="56"/>
-              <w:left w:type="dxa" w:w="40"/>
-              <w:bottom w:type="dxa" w:w="56"/>
-              <w:right w:type="dxa" w:w="150"/>
-            </w:tcMar>
-            <w:vAlign w:val="top"/>
-          </w:tcPr>
-          <w:p>
-            <w:pPr>
-              <w:spacing w:after="0" w:line="248" w:lineRule="auto"/>
-            </w:pPr>
-            <w:r>
-              <w:rPr>
-                <w:rFonts w:ascii="Calibri" w:cs="Calibri" w:eastAsia="Calibri" w:hAnsi="Calibri"/>
-                <w:b/>
-                <w:bCs/>
-                <w:color w:val="43724E"/>
-                <w:spacing w:val="6"/>
-                <w:sz w:val="14"/>
-                <w:szCs w:val="14"/>
-              </w:rPr>
-              <w:t xml:space="preserve">CONFIRMED</w:t>
-            </w:r>
-            <w:r>
-              <w:rPr>
-                <w:rFonts w:ascii="Calibri" w:cs="Calibri" w:eastAsia="Calibri" w:hAnsi="Calibri"/>
-                <w:b w:val="false"/>
-                <w:bCs w:val="false"/>
-                <w:i w:val="false"/>
-                <w:iCs w:val="false"/>
-                <w:color w:val="3A3A38"/>
-                <w:sz w:val="18"/>
-                <w:szCs w:val="18"/>
-              </w:rPr>
-              <w:t xml:space="preserve">  After permissions, SAM links the guard to the NFC setting — NFC reads the checkpoint tags. The guard switches it on, returns, and confirms. Not every site uses NFC, but having it on costs nothing and avoids a failure later, so it is part of setup for everyone.</w:t>
-            </w:r>
-          </w:p>
-        </w:tc>
-      </w:tr>
-      <w:tr>
-        <w:trPr>
-          <w:cantSplit/>
-        </w:trPr>
-        <w:tc>
-          <w:tcPr>
-            <w:tcW w:type="dxa" w:w="850"/>
-            <w:tcBorders>
-              <w:top w:val="none"/>
-              <w:left w:val="none"/>
-              <w:bottom w:val="none"/>
-              <w:right w:val="none"/>
-            </w:tcBorders>
-            <w:tcMar>
-              <w:top w:type="dxa" w:w="56"/>
-              <w:left w:type="dxa" w:w="40"/>
-              <w:bottom w:type="dxa" w:w="56"/>
-              <w:right w:type="dxa" w:w="150"/>
-            </w:tcMar>
-            <w:vAlign w:val="top"/>
-          </w:tcPr>
-          <w:p>
-            <w:pPr>
-              <w:spacing w:after="0" w:line="248" w:lineRule="auto"/>
-            </w:pPr>
-            <w:r>
-              <w:rPr>
-                <w:rFonts w:ascii="Calibri" w:cs="Calibri" w:eastAsia="Calibri" w:hAnsi="Calibri"/>
-                <w:b w:val="false"/>
-                <w:bCs w:val="false"/>
-                <w:i w:val="false"/>
-                <w:iCs w:val="false"/>
-                <w:color w:val="3A3A38"/>
-                <w:sz w:val="18"/>
-                <w:szCs w:val="18"/>
-              </w:rPr>
-              <w:t xml:space="preserve">FR-23</w:t>
-            </w:r>
-          </w:p>
-        </w:tc>
-        <w:tc>
-          <w:tcPr>
-            <w:tcW w:type="dxa" w:w="2100"/>
-            <w:tcBorders>
-              <w:top w:val="none"/>
-              <w:left w:val="none"/>
-              <w:bottom w:val="none"/>
-              <w:right w:val="none"/>
-            </w:tcBorders>
-            <w:tcMar>
-              <w:top w:type="dxa" w:w="56"/>
-              <w:left w:type="dxa" w:w="40"/>
-              <w:bottom w:type="dxa" w:w="56"/>
-              <w:right w:type="dxa" w:w="150"/>
-            </w:tcMar>
-            <w:vAlign w:val="top"/>
-          </w:tcPr>
-          <w:p>
-            <w:pPr>
-              <w:spacing w:after="0" w:line="248" w:lineRule="auto"/>
-            </w:pPr>
-            <w:r>
-              <w:rPr>
-                <w:rFonts w:ascii="Calibri" w:cs="Calibri" w:eastAsia="Calibri" w:hAnsi="Calibri"/>
-                <w:b/>
-                <w:bCs/>
-                <w:i w:val="false"/>
-                <w:iCs w:val="false"/>
-                <w:color w:val="3A3A38"/>
-                <w:sz w:val="18"/>
-                <w:szCs w:val="18"/>
-              </w:rPr>
-              <w:t xml:space="preserve">Background tracking gate</w:t>
-            </w:r>
-          </w:p>
-        </w:tc>
-        <w:tc>
-          <w:tcPr>
-            <w:tcW w:type="dxa" w:w="6698"/>
-            <w:tcBorders>
-              <w:top w:val="none"/>
-              <w:left w:val="none"/>
-              <w:bottom w:val="none"/>
-              <w:right w:val="none"/>
-            </w:tcBorders>
-            <w:tcMar>
-              <w:top w:type="dxa" w:w="56"/>
-              <w:left w:type="dxa" w:w="40"/>
-              <w:bottom w:type="dxa" w:w="56"/>
-              <w:right w:type="dxa" w:w="150"/>
-            </w:tcMar>
-            <w:vAlign w:val="top"/>
-          </w:tcPr>
-          <w:p>
-            <w:pPr>
-              <w:spacing w:after="0" w:line="248" w:lineRule="auto"/>
-            </w:pPr>
-            <w:r>
-              <w:rPr>
-                <w:rFonts w:ascii="Calibri" w:cs="Calibri" w:eastAsia="Calibri" w:hAnsi="Calibri"/>
-                <w:b/>
-                <w:bCs/>
-                <w:color w:val="43724E"/>
-                <w:spacing w:val="6"/>
-                <w:sz w:val="14"/>
-                <w:szCs w:val="14"/>
-              </w:rPr>
-              <w:t xml:space="preserve">CONFIRMED</w:t>
-            </w:r>
-            <w:r>
-              <w:rPr>
-                <w:rFonts w:ascii="Calibri" w:cs="Calibri" w:eastAsia="Calibri" w:hAnsi="Calibri"/>
-                <w:b w:val="false"/>
-                <w:bCs w:val="false"/>
-                <w:i w:val="false"/>
-                <w:iCs w:val="false"/>
-                <w:color w:val="3A3A38"/>
-                <w:sz w:val="18"/>
-                <w:szCs w:val="18"/>
-              </w:rPr>
-              <w:t xml:space="preserve">  The third and last setup gate: background tracking, which lives in SAM OnSite’s own settings screen. Same shape as the other two — SAM explains why it is needed, links straight to the setting from inside onboarding, the guard switches it on and returns to confirm. After this gate every setting the app needs is active and the practice steps can begin.</w:t>
-            </w:r>
-          </w:p>
-        </w:tc>
-      </w:tr>
-      <w:tr>
-        <w:trPr>
-          <w:cantSplit/>
-        </w:trPr>
-        <w:tc>
-          <w:tcPr>
-            <w:tcW w:type="dxa" w:w="850"/>
-            <w:tcBorders>
-              <w:top w:val="none"/>
-              <w:left w:val="none"/>
-              <w:bottom w:val="none"/>
-              <w:right w:val="none"/>
-            </w:tcBorders>
-            <w:tcMar>
-              <w:top w:type="dxa" w:w="56"/>
-              <w:left w:type="dxa" w:w="40"/>
-              <w:bottom w:type="dxa" w:w="56"/>
-              <w:right w:type="dxa" w:w="150"/>
-            </w:tcMar>
-            <w:vAlign w:val="top"/>
-          </w:tcPr>
-          <w:p>
-            <w:pPr>
-              <w:spacing w:after="0" w:line="248" w:lineRule="auto"/>
-            </w:pPr>
-            <w:r>
-              <w:rPr>
-                <w:rFonts w:ascii="Calibri" w:cs="Calibri" w:eastAsia="Calibri" w:hAnsi="Calibri"/>
-                <w:b w:val="false"/>
-                <w:bCs w:val="false"/>
-                <w:i w:val="false"/>
-                <w:iCs w:val="false"/>
-                <w:color w:val="3A3A38"/>
-                <w:sz w:val="18"/>
-                <w:szCs w:val="18"/>
-              </w:rPr>
-              <w:t xml:space="preserve">FR-24</w:t>
-            </w:r>
-          </w:p>
-        </w:tc>
-        <w:tc>
-          <w:tcPr>
-            <w:tcW w:type="dxa" w:w="2100"/>
-            <w:tcBorders>
-              <w:top w:val="none"/>
-              <w:left w:val="none"/>
-              <w:bottom w:val="none"/>
-              <w:right w:val="none"/>
-            </w:tcBorders>
-            <w:tcMar>
-              <w:top w:type="dxa" w:w="56"/>
-              <w:left w:type="dxa" w:w="40"/>
-              <w:bottom w:type="dxa" w:w="56"/>
-              <w:right w:type="dxa" w:w="150"/>
-            </w:tcMar>
-            <w:vAlign w:val="top"/>
-          </w:tcPr>
-          <w:p>
-            <w:pPr>
-              <w:spacing w:after="0" w:line="248" w:lineRule="auto"/>
-            </w:pPr>
-            <w:r>
-              <w:rPr>
-                <w:rFonts w:ascii="Calibri" w:cs="Calibri" w:eastAsia="Calibri" w:hAnsi="Calibri"/>
-                <w:b/>
-                <w:bCs/>
-                <w:i w:val="false"/>
-                <w:iCs w:val="false"/>
-                <w:color w:val="3A3A38"/>
-                <w:sz w:val="18"/>
-                <w:szCs w:val="18"/>
-              </w:rPr>
-              <w:t xml:space="preserve">Check the settings rather than asking</w:t>
-            </w:r>
-          </w:p>
-        </w:tc>
-        <w:tc>
-          <w:tcPr>
-            <w:tcW w:type="dxa" w:w="6698"/>
-            <w:tcBorders>
-              <w:top w:val="none"/>
-              <w:left w:val="none"/>
-              <w:bottom w:val="none"/>
-              <w:right w:val="none"/>
-            </w:tcBorders>
-            <w:tcMar>
-              <w:top w:type="dxa" w:w="56"/>
-              <w:left w:type="dxa" w:w="40"/>
-              <w:bottom w:type="dxa" w:w="56"/>
-              <w:right w:type="dxa" w:w="150"/>
-            </w:tcMar>
-            <w:vAlign w:val="top"/>
-          </w:tcPr>
-          <w:p>
-            <w:pPr>
-              <w:spacing w:after="0" w:line="248" w:lineRule="auto"/>
-            </w:pPr>
-            <w:r>
-              <w:rPr>
-                <w:rFonts w:ascii="Calibri" w:cs="Calibri" w:eastAsia="Calibri" w:hAnsi="Calibri"/>
-                <w:b/>
-                <w:bCs/>
-                <w:color w:val="A05A38"/>
-                <w:spacing w:val="6"/>
-                <w:sz w:val="14"/>
-                <w:szCs w:val="14"/>
-              </w:rPr>
-              <w:t xml:space="preserve">CHECK W/ ENG.</w:t>
-            </w:r>
-            <w:r>
-              <w:rPr>
-                <w:rFonts w:ascii="Calibri" w:cs="Calibri" w:eastAsia="Calibri" w:hAnsi="Calibri"/>
-                <w:b w:val="false"/>
-                <w:bCs w:val="false"/>
-                <w:i w:val="false"/>
-                <w:iCs w:val="false"/>
-                <w:color w:val="3A3A38"/>
-                <w:sz w:val="18"/>
-                <w:szCs w:val="18"/>
-              </w:rPr>
-              <w:t xml:space="preserve">  For the MVP the guard confirms each gate themselves. Reading the settings back would be materially better: it removes a step where a guard can confirm without having done it, and converts a confusing failure mid-shift into a clear message during onboarding. The Location screen already surfaces a “Permissions needed” status, so this is at least partly achievable today; how far it extends to NFC and background tracking is for engineering to confirm. Treat as the target state, not MVP scope.</w:t>
             </w:r>
           </w:p>
         </w:tc>

</xml_diff>